<commit_message>
Report: add page borders
Co-Authored-By: Claude Opus 5.5 <noreply@anthropic.com>
Claude-Session: https://claude.ai/code/session_01M4esiNt19AbCEBrqdhjcqk
</commit_message>
<xml_diff>
--- a/docs/Sach_Check_ANN_Project_Report.docx
+++ b/docs/Sach_Check_ANN_Project_Report.docx
@@ -465,7 +465,13 @@
           <w:headerReference w:type="default" r:id="rId6"/>
           <w:footerReference w:type="default" r:id="rId7"/>
           <w:pgSz w:w="11906" w:h="16838" w:orient="portrait"/>
-          <w:pgMar w:top="1250" w:right="1150" w:bottom="1050" w:left="1150" w:header="450" w:footer="450" w:gutter="0"/>
+          <w:pgMar w:top="1450" w:right="1150" w:bottom="1150" w:left="1150" w:header="700" w:footer="650" w:gutter="0"/>
+          <w:pgBorders w:display="allPages" w:offsetFrom="page">
+            <w:top w:val="single" w:color="000000" w:sz="8" w:space="24"/>
+            <w:left w:val="single" w:color="000000" w:sz="8" w:space="24"/>
+            <w:bottom w:val="single" w:color="000000" w:sz="8" w:space="24"/>
+            <w:right w:val="single" w:color="000000" w:sz="8" w:space="24"/>
+          </w:pgBorders>
           <w:pgNumType/>
           <w:docGrid w:linePitch="360"/>
         </w:sectPr>
@@ -10847,7 +10853,13 @@
       <w:headerReference w:type="default" r:id="rId8"/>
       <w:footerReference w:type="default" r:id="rId9"/>
       <w:pgSz w:w="11906" w:h="16838" w:orient="portrait"/>
-      <w:pgMar w:top="1250" w:right="1150" w:bottom="1050" w:left="1150" w:header="450" w:footer="450" w:gutter="0"/>
+      <w:pgMar w:top="1450" w:right="1150" w:bottom="1150" w:left="1150" w:header="700" w:footer="650" w:gutter="0"/>
+      <w:pgBorders w:display="allPages" w:offsetFrom="page">
+        <w:top w:val="single" w:color="000000" w:sz="8" w:space="24"/>
+        <w:left w:val="single" w:color="000000" w:sz="8" w:space="24"/>
+        <w:bottom w:val="single" w:color="000000" w:sz="8" w:space="24"/>
+        <w:right w:val="single" w:color="000000" w:sz="8" w:space="24"/>
+      </w:pgBorders>
       <w:pgNumType/>
       <w:docGrid w:linePitch="360"/>
     </w:sectPr>

</xml_diff>